<commit_message>
Polish assignment report screenshots and deployment note
</commit_message>
<xml_diff>
--- a/Assignment_3_Report.docx
+++ b/Assignment_3_Report.docx
@@ -131,7 +131,7 @@
       <w:r>
         <w:drawing>
           <wp:inline xmlns:a="http://schemas.openxmlformats.org/drawingml/2006/main" xmlns:pic="http://schemas.openxmlformats.org/drawingml/2006/picture">
-            <wp:extent cx="6172200" cy="4543425"/>
+            <wp:extent cx="6172200" cy="4607417"/>
             <wp:docPr id="1" name="Picture 1"/>
             <wp:cNvGraphicFramePr>
               <a:graphicFrameLocks noChangeAspect="1"/>
@@ -152,7 +152,7 @@
                   <pic:spPr>
                     <a:xfrm>
                       <a:off x="0" y="0"/>
-                      <a:ext cx="6172200" cy="4543425"/>
+                      <a:ext cx="6172200" cy="4607417"/>
                     </a:xfrm>
                     <a:prstGeom prst="rect"/>
                   </pic:spPr>
@@ -272,7 +272,7 @@
       <w:r>
         <w:drawing>
           <wp:inline xmlns:a="http://schemas.openxmlformats.org/drawingml/2006/main" xmlns:pic="http://schemas.openxmlformats.org/drawingml/2006/picture">
-            <wp:extent cx="1508760" cy="3481754"/>
+            <wp:extent cx="1508760" cy="3592286"/>
             <wp:docPr id="3" name="Picture 3"/>
             <wp:cNvGraphicFramePr>
               <a:graphicFrameLocks noChangeAspect="1"/>
@@ -293,7 +293,7 @@
                   <pic:spPr>
                     <a:xfrm>
                       <a:off x="0" y="0"/>
-                      <a:ext cx="1508760" cy="3481754"/>
+                      <a:ext cx="1508760" cy="3592286"/>
                     </a:xfrm>
                     <a:prstGeom prst="rect"/>
                   </pic:spPr>
@@ -426,7 +426,7 @@
       <w:r>
         <w:drawing>
           <wp:inline xmlns:a="http://schemas.openxmlformats.org/drawingml/2006/main" xmlns:pic="http://schemas.openxmlformats.org/drawingml/2006/picture">
-            <wp:extent cx="6126480" cy="3361055"/>
+            <wp:extent cx="6126480" cy="3408394"/>
             <wp:docPr id="5" name="Picture 5"/>
             <wp:cNvGraphicFramePr>
               <a:graphicFrameLocks noChangeAspect="1"/>
@@ -447,7 +447,7 @@
                   <pic:spPr>
                     <a:xfrm>
                       <a:off x="0" y="0"/>
-                      <a:ext cx="6126480" cy="3361055"/>
+                      <a:ext cx="6126480" cy="3408394"/>
                     </a:xfrm>
                     <a:prstGeom prst="rect"/>
                   </pic:spPr>
@@ -580,7 +580,7 @@
       <w:r>
         <w:drawing>
           <wp:inline xmlns:a="http://schemas.openxmlformats.org/drawingml/2006/main" xmlns:pic="http://schemas.openxmlformats.org/drawingml/2006/picture">
-            <wp:extent cx="5669280" cy="3223260"/>
+            <wp:extent cx="5669280" cy="2914489"/>
             <wp:docPr id="7" name="Picture 7"/>
             <wp:cNvGraphicFramePr>
               <a:graphicFrameLocks noChangeAspect="1"/>
@@ -601,7 +601,7 @@
                   <pic:spPr>
                     <a:xfrm>
                       <a:off x="0" y="0"/>
-                      <a:ext cx="5669280" cy="3223260"/>
+                      <a:ext cx="5669280" cy="2914489"/>
                     </a:xfrm>
                     <a:prstGeom prst="rect"/>
                   </pic:spPr>
@@ -711,7 +711,7 @@
     </w:p>
     <w:p>
       <w:r>
-        <w:t>Media queries provide precise control over a specific component, while Bootstrap speeds up repeated page layout and component styling. Combining both approaches kept the card exercise explicit and made the rest of the website consistent. Before submission, the live URL should be checked to confirm the newest commit has finished publishing.</w:t>
+        <w:t>Media queries provide precise control over a specific component, while Bootstrap speeds up repeated page layout and component styling. Combining both approaches kept the card exercise explicit and made the rest of the website consistent. The live URL was checked after GitHub Pages completed deployment.</w:t>
       </w:r>
     </w:p>
     <w:sectPr>

</xml_diff>